<commit_message>
add items to basket
</commit_message>
<xml_diff>
--- a/docs/Group Work Student Workbook & Contract (Complete).docx
+++ b/docs/Group Work Student Workbook & Contract (Complete).docx
@@ -95,13 +95,8 @@
           <w:numId w:val="8"/>
         </w:numPr>
       </w:pPr>
-      <w:proofErr w:type="spellStart"/>
-      <w:r>
-        <w:t>Organise</w:t>
-      </w:r>
-      <w:proofErr w:type="spellEnd"/>
-      <w:r>
-        <w:t xml:space="preserve"> your time and workload  </w:t>
+      <w:r>
+        <w:t xml:space="preserve">Organise your time and workload  </w:t>
       </w:r>
     </w:p>
     <w:p>
@@ -214,6 +209,9 @@
         <w:pStyle w:val="BodyText"/>
       </w:pPr>
       <w:r>
+        <w:t>70</w:t>
+      </w:r>
+      <w:r>
         <w:br/>
         <w:t>__________________________________________________</w:t>
       </w:r>
@@ -249,6 +247,9 @@
       <w:r>
         <w:t xml:space="preserve">☐ Fair workload  </w:t>
       </w:r>
+      <w:r>
+        <w:t>(yes)</w:t>
+      </w:r>
     </w:p>
     <w:p>
       <w:pPr>
@@ -257,6 +258,9 @@
       <w:r>
         <w:t xml:space="preserve">☐ Low stress </w:t>
       </w:r>
+      <w:r>
+        <w:t>(yes)</w:t>
+      </w:r>
     </w:p>
     <w:p>
       <w:pPr>
@@ -265,6 +269,9 @@
       <w:r>
         <w:t xml:space="preserve">☐ Clear communication </w:t>
       </w:r>
+      <w:r>
+        <w:t>(yes)</w:t>
+      </w:r>
     </w:p>
     <w:p>
       <w:pPr>
@@ -273,6 +280,9 @@
       <w:r>
         <w:t xml:space="preserve">☐ Everyone contributes </w:t>
       </w:r>
+      <w:r>
+        <w:t>(yes)</w:t>
+      </w:r>
     </w:p>
     <w:p>
       <w:pPr>
@@ -281,6 +291,9 @@
       <w:r>
         <w:t xml:space="preserve">☐ Strong final submission </w:t>
       </w:r>
+      <w:r>
+        <w:t>(yes)</w:t>
+      </w:r>
     </w:p>
     <w:p>
       <w:pPr>
@@ -289,12 +302,16 @@
       <w:r>
         <w:t>☐ Employability skills development</w:t>
       </w:r>
+      <w:r>
+        <w:t xml:space="preserve"> (yes)</w:t>
+      </w:r>
     </w:p>
     <w:p>
       <w:pPr>
         <w:pStyle w:val="BodyText"/>
       </w:pPr>
       <w:r>
+        <w:lastRenderedPageBreak/>
         <w:t>Do you have any o</w:t>
       </w:r>
       <w:r>
@@ -312,7 +329,10 @@
         <w:pStyle w:val="BodyText"/>
       </w:pPr>
       <w:r>
-        <w:t xml:space="preserve"> __________________________________________________</w:t>
+        <w:t xml:space="preserve"> </w:t>
+      </w:r>
+      <w:r>
+        <w:t>Strict time management</w:t>
       </w:r>
     </w:p>
     <w:p>
@@ -477,6 +497,9 @@
       <w:r>
         <w:t xml:space="preserve">☐ Unequal contribution </w:t>
       </w:r>
+      <w:r>
+        <w:t>(yes)</w:t>
+      </w:r>
     </w:p>
     <w:p>
       <w:pPr>
@@ -501,6 +524,9 @@
       <w:r>
         <w:t xml:space="preserve">☐ Ghosting / no responses </w:t>
       </w:r>
+      <w:r>
+        <w:t>(yes)</w:t>
+      </w:r>
     </w:p>
     <w:p>
       <w:pPr>
@@ -516,6 +542,9 @@
       </w:pPr>
       <w:r>
         <w:t>☐ Dominating group members</w:t>
+      </w:r>
+      <w:r>
+        <w:t xml:space="preserve"> </w:t>
       </w:r>
     </w:p>
     <w:p>
@@ -546,7 +575,13 @@
         <w:pStyle w:val="BodyText"/>
       </w:pPr>
       <w:r>
-        <w:t>__________________________________________________</w:t>
+        <w:t>_______</w:t>
+      </w:r>
+      <w:r>
+        <w:t>Unequal contribution</w:t>
+      </w:r>
+      <w:r>
+        <w:t>___________________________________________</w:t>
       </w:r>
     </w:p>
     <w:p>
@@ -564,6 +599,7 @@
       <w:bookmarkEnd w:id="6"/>
       <w:bookmarkEnd w:id="7"/>
       <w:r>
+        <w:lastRenderedPageBreak/>
         <w:t>Options</w:t>
       </w:r>
       <w:r>
@@ -612,7 +648,10 @@
         <w:t>Main platform (e.g. WhatsApp, Teams):</w:t>
       </w:r>
       <w:r>
-        <w:t xml:space="preserve"> __________________________</w:t>
+        <w:t xml:space="preserve"> </w:t>
+      </w:r>
+      <w:r>
+        <w:t>WhatsApp, Discord</w:t>
       </w:r>
     </w:p>
     <w:p>
@@ -631,7 +670,10 @@
         <w:t>Expected response time:</w:t>
       </w:r>
       <w:r>
-        <w:t xml:space="preserve"> ______________________________________</w:t>
+        <w:t xml:space="preserve"> </w:t>
+      </w:r>
+      <w:r>
+        <w:t>No longer than 36 hours</w:t>
       </w:r>
     </w:p>
     <w:p>
@@ -650,7 +692,10 @@
         <w:t>What counts as urgent:</w:t>
       </w:r>
       <w:r>
-        <w:t xml:space="preserve"> _______________________________________</w:t>
+        <w:t xml:space="preserve"> </w:t>
+      </w:r>
+      <w:r>
+        <w:t>Immediate acknowledgment for major advancements</w:t>
       </w:r>
     </w:p>
     <w:p>
@@ -690,7 +735,9 @@
       </w:r>
       <w:r>
         <w:br/>
-        <w:t>__________________________________________________</w:t>
+      </w:r>
+      <w:r>
+        <w:t>Playing a part in the team to complete assigned tasks before deadlines</w:t>
       </w:r>
     </w:p>
     <w:p>
@@ -705,7 +752,9 @@
       </w:r>
       <w:r>
         <w:br/>
-        <w:t>__________________________________________________</w:t>
+      </w:r>
+      <w:r>
+        <w:t>Contact the team and explain that they are behind. Must ask for help if they need it</w:t>
       </w:r>
     </w:p>
     <w:p>
@@ -720,7 +769,9 @@
       </w:r>
       <w:r>
         <w:br/>
-        <w:t>__________________________________________________</w:t>
+      </w:r>
+      <w:r>
+        <w:t xml:space="preserve">Dilshan </w:t>
       </w:r>
     </w:p>
     <w:p>
@@ -764,7 +815,10 @@
         <w:t>Assignment title:</w:t>
       </w:r>
       <w:r>
-        <w:t xml:space="preserve"> ____________________________________________</w:t>
+        <w:t xml:space="preserve"> </w:t>
+      </w:r>
+      <w:r>
+        <w:t>DESD</w:t>
       </w:r>
     </w:p>
     <w:p>
@@ -783,7 +837,10 @@
         <w:t>Submission format:</w:t>
       </w:r>
       <w:r>
-        <w:t xml:space="preserve"> __________________________________________</w:t>
+        <w:t xml:space="preserve"> </w:t>
+      </w:r>
+      <w:r>
+        <w:t>Link to github repository</w:t>
       </w:r>
     </w:p>
     <w:p>
@@ -802,7 +859,7 @@
         <w:t>Word count / requirements:</w:t>
       </w:r>
       <w:r>
-        <w:t xml:space="preserve"> _________________________________</w:t>
+        <w:t xml:space="preserve"> No documentation or expected word count required. </w:t>
       </w:r>
     </w:p>
     <w:p>
@@ -821,7 +878,10 @@
         <w:t>Marking criteria (key priorities):</w:t>
       </w:r>
       <w:r>
-        <w:t xml:space="preserve"> __________________________________________________</w:t>
+        <w:t xml:space="preserve"> </w:t>
+      </w:r>
+      <w:r>
+        <w:t>Team management, collaboration, solid software platform</w:t>
       </w:r>
     </w:p>
     <w:p>
@@ -882,9 +942,9 @@
         <w:tblLook w:val="0020" w:firstRow="1" w:lastRow="0" w:firstColumn="0" w:lastColumn="0" w:noHBand="0" w:noVBand="0"/>
       </w:tblPr>
       <w:tblGrid>
-        <w:gridCol w:w="692"/>
-        <w:gridCol w:w="2269"/>
-        <w:gridCol w:w="2221"/>
+        <w:gridCol w:w="5931"/>
+        <w:gridCol w:w="1675"/>
+        <w:gridCol w:w="1754"/>
       </w:tblGrid>
       <w:tr>
         <w:trPr>
@@ -900,6 +960,7 @@
               <w:pStyle w:val="Compact"/>
             </w:pPr>
             <w:r>
+              <w:lastRenderedPageBreak/>
               <w:t>Task</w:t>
             </w:r>
           </w:p>
@@ -939,7 +1000,74 @@
           <w:p>
             <w:pPr>
               <w:pStyle w:val="Compact"/>
-            </w:pPr>
+              <w:rPr>
+                <w:b/>
+                <w:bCs/>
+              </w:rPr>
+            </w:pPr>
+            <w:r>
+              <w:t>(</w:t>
+            </w:r>
+            <w:r>
+              <w:rPr>
+                <w:b/>
+                <w:bCs/>
+              </w:rPr>
+              <w:t>PLEASE ADD YOUR TASKS AND DEADLINES HERE</w:t>
+            </w:r>
+            <w:r>
+              <w:rPr>
+                <w:b/>
+                <w:bCs/>
+              </w:rPr>
+              <w:t xml:space="preserve"> </w:t>
+            </w:r>
+            <w:r>
+              <w:rPr>
+                <w:b/>
+                <w:bCs/>
+              </w:rPr>
+              <w:t>BEFORE SIGNING DOCUMENT</w:t>
+            </w:r>
+            <w:r>
+              <w:rPr>
+                <w:b/>
+                <w:bCs/>
+              </w:rPr>
+              <w:t>)</w:t>
+            </w:r>
+          </w:p>
+          <w:p>
+            <w:pPr>
+              <w:pStyle w:val="Compact"/>
+              <w:rPr>
+                <w:b/>
+                <w:bCs/>
+              </w:rPr>
+            </w:pPr>
+            <w:r>
+              <w:rPr>
+                <w:b/>
+                <w:bCs/>
+              </w:rPr>
+              <w:t>Additional tasks on Jira</w:t>
+            </w:r>
+          </w:p>
+          <w:p>
+            <w:pPr>
+              <w:pStyle w:val="Compact"/>
+              <w:rPr>
+                <w:b/>
+                <w:bCs/>
+              </w:rPr>
+            </w:pPr>
+            <w:r>
+              <w:rPr>
+                <w:b/>
+                <w:bCs/>
+              </w:rPr>
+              <w:t>Sprint and 2 below</w:t>
+            </w:r>
           </w:p>
         </w:tc>
         <w:tc>
@@ -972,22 +1100,185 @@
             <w:pPr>
               <w:pStyle w:val="Compact"/>
             </w:pPr>
-          </w:p>
-        </w:tc>
-        <w:tc>
-          <w:tcPr>
-            <w:tcW w:w="0" w:type="auto"/>
-          </w:tcPr>
-          <w:p>
-            <w:pPr>
-              <w:pStyle w:val="Compact"/>
-            </w:pPr>
-          </w:p>
-        </w:tc>
-        <w:tc>
-          <w:tcPr>
-            <w:tcW w:w="0" w:type="auto"/>
-          </w:tcPr>
+            <w:r>
+              <w:t>Containerisation</w:t>
+            </w:r>
+          </w:p>
+          <w:p>
+            <w:pPr>
+              <w:pStyle w:val="Compact"/>
+            </w:pPr>
+            <w:r>
+              <w:t>Database connection</w:t>
+            </w:r>
+          </w:p>
+          <w:p>
+            <w:pPr>
+              <w:pStyle w:val="Compact"/>
+            </w:pPr>
+            <w:r>
+              <w:t>Cust/prod account creation</w:t>
+            </w:r>
+          </w:p>
+          <w:p>
+            <w:pPr>
+              <w:pStyle w:val="Compact"/>
+            </w:pPr>
+            <w:r>
+              <w:t>Build html base template and styles sheet</w:t>
+            </w:r>
+          </w:p>
+          <w:p>
+            <w:pPr>
+              <w:pStyle w:val="Compact"/>
+            </w:pPr>
+            <w:r>
+              <w:t>View products page</w:t>
+            </w:r>
+          </w:p>
+          <w:p>
+            <w:pPr>
+              <w:pStyle w:val="Compact"/>
+            </w:pPr>
+            <w:r>
+              <w:t>Add products to basket</w:t>
+            </w:r>
+          </w:p>
+          <w:p>
+            <w:pPr>
+              <w:pStyle w:val="Compact"/>
+            </w:pPr>
+            <w:r>
+              <w:t>View producer bio/write producer bio</w:t>
+            </w:r>
+          </w:p>
+          <w:p>
+            <w:pPr>
+              <w:pStyle w:val="Compact"/>
+            </w:pPr>
+          </w:p>
+        </w:tc>
+        <w:tc>
+          <w:tcPr>
+            <w:tcW w:w="0" w:type="auto"/>
+          </w:tcPr>
+          <w:p>
+            <w:pPr>
+              <w:pStyle w:val="Compact"/>
+            </w:pPr>
+            <w:r>
+              <w:t>Jon Frost</w:t>
+            </w:r>
+          </w:p>
+          <w:p>
+            <w:pPr>
+              <w:pStyle w:val="Compact"/>
+            </w:pPr>
+            <w:r>
+              <w:t>Jon Frost</w:t>
+            </w:r>
+          </w:p>
+          <w:p>
+            <w:pPr>
+              <w:pStyle w:val="Compact"/>
+            </w:pPr>
+            <w:r>
+              <w:t>Jon Frost</w:t>
+            </w:r>
+          </w:p>
+          <w:p>
+            <w:pPr>
+              <w:pStyle w:val="Compact"/>
+            </w:pPr>
+            <w:r>
+              <w:t>Jon Frost</w:t>
+            </w:r>
+          </w:p>
+          <w:p>
+            <w:pPr>
+              <w:pStyle w:val="Compact"/>
+            </w:pPr>
+            <w:r>
+              <w:t>Jon Frost</w:t>
+            </w:r>
+          </w:p>
+          <w:p>
+            <w:pPr>
+              <w:pStyle w:val="Compact"/>
+            </w:pPr>
+            <w:r>
+              <w:t>Jon Frost</w:t>
+            </w:r>
+          </w:p>
+          <w:p>
+            <w:pPr>
+              <w:pStyle w:val="Compact"/>
+            </w:pPr>
+            <w:r>
+              <w:t>Jon Frost</w:t>
+            </w:r>
+          </w:p>
+        </w:tc>
+        <w:tc>
+          <w:tcPr>
+            <w:tcW w:w="0" w:type="auto"/>
+          </w:tcPr>
+          <w:p>
+            <w:pPr>
+              <w:pStyle w:val="Compact"/>
+            </w:pPr>
+            <w:r>
+              <w:t>15/02</w:t>
+            </w:r>
+          </w:p>
+          <w:p>
+            <w:pPr>
+              <w:pStyle w:val="Compact"/>
+            </w:pPr>
+            <w:r>
+              <w:t>15/02</w:t>
+            </w:r>
+          </w:p>
+          <w:p>
+            <w:pPr>
+              <w:pStyle w:val="Compact"/>
+            </w:pPr>
+            <w:r>
+              <w:t>20/02</w:t>
+            </w:r>
+          </w:p>
+          <w:p>
+            <w:pPr>
+              <w:pStyle w:val="Compact"/>
+            </w:pPr>
+            <w:r>
+              <w:t>21/02</w:t>
+            </w:r>
+          </w:p>
+          <w:p>
+            <w:pPr>
+              <w:pStyle w:val="Compact"/>
+            </w:pPr>
+            <w:r>
+              <w:t>21/02</w:t>
+            </w:r>
+          </w:p>
+          <w:p>
+            <w:pPr>
+              <w:pStyle w:val="Compact"/>
+            </w:pPr>
+            <w:r>
+              <w:t>10/03</w:t>
+            </w:r>
+          </w:p>
+          <w:p>
+            <w:pPr>
+              <w:pStyle w:val="Compact"/>
+            </w:pPr>
+            <w:r>
+              <w:t>12/03</w:t>
+            </w:r>
+          </w:p>
           <w:p>
             <w:pPr>
               <w:pStyle w:val="Compact"/>
@@ -1148,7 +1439,18 @@
       </w:r>
       <w:r>
         <w:br/>
-        <w:t>__________________________________________________</w:t>
+      </w:r>
+      <w:r>
+        <w:t>C</w:t>
+      </w:r>
+      <w:r>
+        <w:t xml:space="preserve">ontact </w:t>
+      </w:r>
+      <w:r>
+        <w:t>member and ask if they need assistance</w:t>
+      </w:r>
+      <w:r>
+        <w:t>, Less marks</w:t>
       </w:r>
     </w:p>
     <w:p>
@@ -1164,7 +1466,12 @@
       </w:r>
       <w:r>
         <w:br/>
-        <w:t>__________________________________________________</w:t>
+      </w:r>
+      <w:r>
+        <w:t>Keep attempting to contact, notify tutor</w:t>
+      </w:r>
+      <w:r>
+        <w:t>, less marks if repeated</w:t>
       </w:r>
     </w:p>
     <w:p>
@@ -1176,11 +1483,17 @@
           <w:b/>
           <w:bCs/>
         </w:rPr>
+        <w:lastRenderedPageBreak/>
         <w:t>Missed deadlines:</w:t>
       </w:r>
       <w:r>
         <w:br/>
-        <w:t>__________________________________________________</w:t>
+      </w:r>
+      <w:r>
+        <w:t>Remind member of deadlines, amend task allocations</w:t>
+      </w:r>
+      <w:r>
+        <w:t>, less marks if repeated</w:t>
       </w:r>
     </w:p>
     <w:p>
@@ -1196,7 +1509,9 @@
       </w:r>
       <w:r>
         <w:br/>
-        <w:t>__________________________________________________</w:t>
+      </w:r>
+      <w:r>
+        <w:t>Ask for group meetings to discuss project with all members present</w:t>
       </w:r>
     </w:p>
     <w:p>
@@ -1236,7 +1551,13 @@
         <w:t>Who will we contact?</w:t>
       </w:r>
       <w:r>
-        <w:t xml:space="preserve"> ________________________________________ </w:t>
+        <w:t xml:space="preserve"> Dilshan</w:t>
+      </w:r>
+      <w:r>
+        <w:t xml:space="preserve"> </w:t>
+      </w:r>
+      <w:r>
+        <w:t>and Khoa</w:t>
       </w:r>
     </w:p>
     <w:p>
@@ -1251,7 +1572,13 @@
         <w:t>What evidence will we provide?</w:t>
       </w:r>
       <w:r>
-        <w:t xml:space="preserve"> _______________________________</w:t>
+        <w:t xml:space="preserve"> </w:t>
+      </w:r>
+      <w:r>
+        <w:t>Github commit history</w:t>
+      </w:r>
+      <w:r>
+        <w:t>, this document for task allocation</w:t>
       </w:r>
     </w:p>
     <w:p>
@@ -1284,6 +1611,9 @@
       <w:pPr>
         <w:pStyle w:val="BodyText"/>
       </w:pPr>
+      <w:r>
+        <w:t xml:space="preserve">J Frost, </w:t>
+      </w:r>
     </w:p>
     <w:p>
       <w:pPr>
@@ -1360,7 +1690,10 @@
         <w:t>Check-in day:</w:t>
       </w:r>
       <w:r>
-        <w:t xml:space="preserve"> _______________________________________________</w:t>
+        <w:t xml:space="preserve"> </w:t>
+      </w:r>
+      <w:r>
+        <w:t>Monday</w:t>
       </w:r>
     </w:p>
     <w:p>
@@ -1769,6 +2102,9 @@
       <w:r>
         <w:t xml:space="preserve">☐ Internal deadlines are non-negotiable  </w:t>
       </w:r>
+      <w:r>
+        <w:t xml:space="preserve"> (yes)</w:t>
+      </w:r>
     </w:p>
     <w:p>
       <w:pPr>
@@ -1777,6 +2113,9 @@
       <w:r>
         <w:t xml:space="preserve">☐ Final week is for editing and polishing only </w:t>
       </w:r>
+      <w:r>
+        <w:t>(not necessarily)</w:t>
+      </w:r>
     </w:p>
     <w:p>
       <w:pPr>
@@ -1785,6 +2124,12 @@
       <w:r>
         <w:t xml:space="preserve">☐ No one person finishes everything </w:t>
       </w:r>
+      <w:r>
+        <w:t>(yes)</w:t>
+      </w:r>
+      <w:r>
+        <w:tab/>
+      </w:r>
     </w:p>
     <w:p>
       <w:pPr>
@@ -1793,6 +2138,9 @@
       <w:r>
         <w:t>☐ Progress is visible to everyone</w:t>
       </w:r>
+      <w:r>
+        <w:t xml:space="preserve"> (yes)</w:t>
+      </w:r>
     </w:p>
     <w:p>
       <w:pPr>
@@ -1812,7 +2160,29 @@
         <w:pStyle w:val="BodyText"/>
       </w:pPr>
       <w:r>
-        <w:t>__________________________________________________</w:t>
+        <w:t>Ask for help if needed</w:t>
+      </w:r>
+    </w:p>
+    <w:p>
+      <w:pPr>
+        <w:pStyle w:val="BodyText"/>
+      </w:pPr>
+      <w:r>
+        <w:t>If cannot complete task by deadline, ask for an extension</w:t>
+      </w:r>
+    </w:p>
+    <w:p>
+      <w:pPr>
+        <w:pStyle w:val="BodyText"/>
+      </w:pPr>
+      <w:r>
+        <w:t xml:space="preserve">Commit </w:t>
+      </w:r>
+      <w:r>
+        <w:t xml:space="preserve">to github </w:t>
+      </w:r>
+      <w:r>
+        <w:t xml:space="preserve">regularly </w:t>
       </w:r>
     </w:p>
     <w:p>
@@ -1867,7 +2237,10 @@
         <w:t>One communication habit:</w:t>
       </w:r>
       <w:r>
-        <w:t xml:space="preserve"> _________________________________</w:t>
+        <w:t xml:space="preserve"> </w:t>
+      </w:r>
+      <w:r>
+        <w:t>Project discussions in whatsapp/discord</w:t>
       </w:r>
     </w:p>
     <w:p>
@@ -1886,7 +2259,17 @@
         <w:t>One conflict behaviour:</w:t>
       </w:r>
       <w:r>
-        <w:t xml:space="preserve"> __________________________________</w:t>
+        <w:rPr>
+          <w:b/>
+          <w:bCs/>
+        </w:rPr>
+        <w:t xml:space="preserve"> </w:t>
+      </w:r>
+      <w:r>
+        <w:t>Discord calls</w:t>
+      </w:r>
+      <w:r>
+        <w:t xml:space="preserve"> to discuss problems </w:t>
       </w:r>
     </w:p>
     <w:p>
@@ -1905,7 +2288,10 @@
         <w:t>One time-management habit:</w:t>
       </w:r>
       <w:r>
-        <w:t xml:space="preserve"> _______________________________</w:t>
+        <w:t xml:space="preserve"> </w:t>
+      </w:r>
+      <w:r>
+        <w:t>Stick to deadlines</w:t>
       </w:r>
     </w:p>
     <w:p>
@@ -1945,7 +2331,10 @@
         <w:t>Group name (</w:t>
       </w:r>
       <w:r>
-        <w:t>naming your group can make it feel more cohesive)</w:t>
+        <w:t>G5</w:t>
+      </w:r>
+      <w:r>
+        <w:t>)</w:t>
       </w:r>
       <w:r>
         <w:rPr>
@@ -1998,7 +2387,7 @@
         <w:tblLook w:val="0020" w:firstRow="1" w:lastRow="0" w:firstColumn="0" w:lastColumn="0" w:noHBand="0" w:noVBand="0"/>
       </w:tblPr>
       <w:tblGrid>
-        <w:gridCol w:w="845"/>
+        <w:gridCol w:w="1142"/>
         <w:gridCol w:w="2277"/>
         <w:gridCol w:w="1785"/>
       </w:tblGrid>
@@ -2065,26 +2454,35 @@
             <w:pPr>
               <w:pStyle w:val="Compact"/>
             </w:pPr>
-          </w:p>
-        </w:tc>
-        <w:tc>
-          <w:tcPr>
-            <w:tcW w:w="0" w:type="auto"/>
-          </w:tcPr>
-          <w:p>
-            <w:pPr>
-              <w:pStyle w:val="Compact"/>
-            </w:pPr>
-          </w:p>
-        </w:tc>
-        <w:tc>
-          <w:tcPr>
-            <w:tcW w:w="0" w:type="auto"/>
-          </w:tcPr>
-          <w:p>
-            <w:pPr>
-              <w:pStyle w:val="Compact"/>
-            </w:pPr>
+            <w:r>
+              <w:t>Jon Frost</w:t>
+            </w:r>
+          </w:p>
+        </w:tc>
+        <w:tc>
+          <w:tcPr>
+            <w:tcW w:w="0" w:type="auto"/>
+          </w:tcPr>
+          <w:p>
+            <w:pPr>
+              <w:pStyle w:val="Compact"/>
+            </w:pPr>
+            <w:r>
+              <w:t>J Frost</w:t>
+            </w:r>
+          </w:p>
+        </w:tc>
+        <w:tc>
+          <w:tcPr>
+            <w:tcW w:w="0" w:type="auto"/>
+          </w:tcPr>
+          <w:p>
+            <w:pPr>
+              <w:pStyle w:val="Compact"/>
+            </w:pPr>
+            <w:r>
+              <w:t>12/03/2026</w:t>
+            </w:r>
           </w:p>
         </w:tc>
       </w:tr>

</xml_diff>